<commit_message>
Add resume certificate verification links
</commit_message>
<xml_diff>
--- a/public/resume/amine-boularbah-resume.docx
+++ b/public/resume/amine-boularbah-resume.docx
@@ -427,6 +427,48 @@
       </w:r>
     </w:p>
     <w:p>
+      <w:r/>
+      <w:hyperlink r:id="rId16">
+        <w:r>
+          <w:rPr>
+            <w:color w:val="000000"/>
+            <w:u w:val="single"/>
+          </w:rPr>
+          <w:t>Verify iOS certificate on Coursera</w:t>
+        </w:r>
+      </w:hyperlink>
+      <w:r/>
+    </w:p>
+    <w:p>
+      <w:pPr>
+        <w:pStyle w:val="Heading2"/>
+      </w:pPr>
+      <w:r>
+        <w:t>React Native Certificate, Meta</w:t>
+      </w:r>
+    </w:p>
+    <w:p>
+      <w:pPr>
+        <w:keepNext w:val="0"/>
+      </w:pPr>
+      <w:r>
+        <w:t>2024</w:t>
+      </w:r>
+    </w:p>
+    <w:p>
+      <w:r/>
+      <w:hyperlink r:id="rId17">
+        <w:r>
+          <w:rPr>
+            <w:color w:val="000000"/>
+            <w:u w:val="single"/>
+          </w:rPr>
+          <w:t>Verify React Native certificate on Coursera</w:t>
+        </w:r>
+      </w:hyperlink>
+      <w:r/>
+    </w:p>
+    <w:p>
       <w:pPr>
         <w:pStyle w:val="Heading1"/>
       </w:pPr>

</xml_diff>

<commit_message>
Add resume certificate verification links (#8)
</commit_message>
<xml_diff>
--- a/public/resume/amine-boularbah-resume.docx
+++ b/public/resume/amine-boularbah-resume.docx
@@ -427,6 +427,48 @@
       </w:r>
     </w:p>
     <w:p>
+      <w:r/>
+      <w:hyperlink r:id="rId16">
+        <w:r>
+          <w:rPr>
+            <w:color w:val="000000"/>
+            <w:u w:val="single"/>
+          </w:rPr>
+          <w:t>Verify iOS certificate on Coursera</w:t>
+        </w:r>
+      </w:hyperlink>
+      <w:r/>
+    </w:p>
+    <w:p>
+      <w:pPr>
+        <w:pStyle w:val="Heading2"/>
+      </w:pPr>
+      <w:r>
+        <w:t>React Native Certificate, Meta</w:t>
+      </w:r>
+    </w:p>
+    <w:p>
+      <w:pPr>
+        <w:keepNext w:val="0"/>
+      </w:pPr>
+      <w:r>
+        <w:t>2024</w:t>
+      </w:r>
+    </w:p>
+    <w:p>
+      <w:r/>
+      <w:hyperlink r:id="rId17">
+        <w:r>
+          <w:rPr>
+            <w:color w:val="000000"/>
+            <w:u w:val="single"/>
+          </w:rPr>
+          <w:t>Verify React Native certificate on Coursera</w:t>
+        </w:r>
+      </w:hyperlink>
+      <w:r/>
+    </w:p>
+    <w:p>
       <w:pPr>
         <w:pStyle w:val="Heading1"/>
       </w:pPr>

</xml_diff>

<commit_message>
Localize resumes and add Fielduro to product history
</commit_message>
<xml_diff>
--- a/public/resume/amine-boularbah-resume.docx
+++ b/public/resume/amine-boularbah-resume.docx
@@ -376,6 +376,37 @@
         <w:pStyle w:val="Heading2"/>
       </w:pPr>
       <w:r>
+        <w:t>Founder &amp; Developer at Fielduro</w:t>
+      </w:r>
+    </w:p>
+    <w:p>
+      <w:pPr>
+        <w:keepNext/>
+      </w:pPr>
+      <w:r>
+        <w:t xml:space="preserve">Malaga · Present · </w:t>
+      </w:r>
+      <w:hyperlink r:id="rId15">
+        <w:r>
+          <w:rPr>
+            <w:color w:val="000000"/>
+            <w:u w:val="single"/>
+          </w:rPr>
+          <w:t>fielduro.com</w:t>
+        </w:r>
+      </w:hyperlink>
+      <w:r/>
+    </w:p>
+    <w:p>
+      <w:r>
+        <w:t>Built a product for independent service businesses that connects estimates, work orders, invoices, and receipts. Designed linked job documents, customer-ready PDFs, and payment tracking.</w:t>
+      </w:r>
+    </w:p>
+    <w:p>
+      <w:pPr>
+        <w:pStyle w:val="Heading2"/>
+      </w:pPr>
+      <w:r>
         <w:t>Founder &amp; Developer at Flura</w:t>
       </w:r>
     </w:p>
@@ -386,7 +417,7 @@
       <w:r>
         <w:t xml:space="preserve">Malaga · Jan 2026 to Present · </w:t>
       </w:r>
-      <w:hyperlink r:id="rId15">
+      <w:hyperlink r:id="rId16">
         <w:r>
           <w:rPr>
             <w:color w:val="000000"/>
@@ -428,7 +459,7 @@
     </w:p>
     <w:p>
       <w:r/>
-      <w:hyperlink r:id="rId16">
+      <w:hyperlink r:id="rId17">
         <w:r>
           <w:rPr>
             <w:color w:val="000000"/>
@@ -457,7 +488,7 @@
     </w:p>
     <w:p>
       <w:r/>
-      <w:hyperlink r:id="rId17">
+      <w:hyperlink r:id="rId18">
         <w:r>
           <w:rPr>
             <w:color w:val="000000"/>
@@ -932,12 +963,13 @@
     <w:rsid w:val="00FC693F"/>
     <w:pPr>
       <w:widowControl/>
-      <w:spacing w:line="252" w:lineRule="auto" w:after="80"/>
+      <w:spacing w:line="252" w:lineRule="auto" w:after="60"/>
     </w:pPr>
     <w:rPr>
       <w:rFonts w:ascii="Arial" w:hAnsi="Arial"/>
       <w:color w:val="000000"/>
       <w:sz w:val="21"/>
+      <w:lang w:val="en-GB"/>
     </w:rPr>
   </w:style>
   <w:style w:type="paragraph" w:styleId="Header">
@@ -996,7 +1028,7 @@
       <w:keepNext/>
       <w:keepLines/>
       <w:widowControl/>
-      <w:spacing w:before="200" w:after="80" w:line="252" w:lineRule="auto"/>
+      <w:spacing w:before="160" w:after="60" w:line="252" w:lineRule="auto"/>
       <w:outlineLvl w:val="0"/>
     </w:pPr>
     <w:rPr>
@@ -1006,6 +1038,7 @@
       <w:color w:val="000000"/>
       <w:sz w:val="24"/>
       <w:szCs w:val="28"/>
+      <w:lang w:val="en-GB"/>
     </w:rPr>
   </w:style>
   <w:style w:type="paragraph" w:styleId="Heading2">
@@ -1021,7 +1054,7 @@
       <w:keepNext/>
       <w:keepLines/>
       <w:widowControl/>
-      <w:spacing w:before="200" w:after="80" w:line="252" w:lineRule="auto"/>
+      <w:spacing w:before="160" w:after="60" w:line="252" w:lineRule="auto"/>
       <w:outlineLvl w:val="1"/>
     </w:pPr>
     <w:rPr>
@@ -1031,6 +1064,7 @@
       <w:color w:val="000000"/>
       <w:sz w:val="21"/>
       <w:szCs w:val="26"/>
+      <w:lang w:val="en-GB"/>
     </w:rPr>
   </w:style>
   <w:style w:type="paragraph" w:styleId="Heading3">
@@ -1284,7 +1318,7 @@
     <w:rsid w:val="00FC693F"/>
     <w:pPr>
       <w:widowControl/>
-      <w:spacing w:after="80" w:line="252" w:lineRule="auto"/>
+      <w:spacing w:after="60" w:line="252" w:lineRule="auto"/>
       <w:contextualSpacing/>
     </w:pPr>
     <w:rPr>
@@ -1294,6 +1328,7 @@
       <w:kern w:val="28"/>
       <w:sz w:val="48"/>
       <w:szCs w:val="52"/>
+      <w:lang w:val="en-GB"/>
     </w:rPr>
   </w:style>
   <w:style w:type="character" w:customStyle="1" w:styleId="TitleChar">
@@ -1467,13 +1502,14 @@
       <w:numPr>
         <w:numId w:val="1"/>
       </w:numPr>
-      <w:spacing w:line="252" w:lineRule="auto" w:after="80"/>
+      <w:spacing w:line="252" w:lineRule="auto" w:after="60"/>
       <w:contextualSpacing/>
     </w:pPr>
     <w:rPr>
       <w:rFonts w:ascii="Arial" w:hAnsi="Arial"/>
       <w:color w:val="000000"/>
       <w:sz w:val="21"/>
+      <w:lang w:val="en-GB"/>
     </w:rPr>
   </w:style>
   <w:style w:type="paragraph" w:styleId="ListBullet2">

</xml_diff>

<commit_message>
Localize resumes and add Fielduro to product history (#10)
</commit_message>
<xml_diff>
--- a/public/resume/amine-boularbah-resume.docx
+++ b/public/resume/amine-boularbah-resume.docx
@@ -376,6 +376,37 @@
         <w:pStyle w:val="Heading2"/>
       </w:pPr>
       <w:r>
+        <w:t>Founder &amp; Developer at Fielduro</w:t>
+      </w:r>
+    </w:p>
+    <w:p>
+      <w:pPr>
+        <w:keepNext/>
+      </w:pPr>
+      <w:r>
+        <w:t xml:space="preserve">Malaga · Present · </w:t>
+      </w:r>
+      <w:hyperlink r:id="rId15">
+        <w:r>
+          <w:rPr>
+            <w:color w:val="000000"/>
+            <w:u w:val="single"/>
+          </w:rPr>
+          <w:t>fielduro.com</w:t>
+        </w:r>
+      </w:hyperlink>
+      <w:r/>
+    </w:p>
+    <w:p>
+      <w:r>
+        <w:t>Built a product for independent service businesses that connects estimates, work orders, invoices, and receipts. Designed linked job documents, customer-ready PDFs, and payment tracking.</w:t>
+      </w:r>
+    </w:p>
+    <w:p>
+      <w:pPr>
+        <w:pStyle w:val="Heading2"/>
+      </w:pPr>
+      <w:r>
         <w:t>Founder &amp; Developer at Flura</w:t>
       </w:r>
     </w:p>
@@ -386,7 +417,7 @@
       <w:r>
         <w:t xml:space="preserve">Malaga · Jan 2026 to Present · </w:t>
       </w:r>
-      <w:hyperlink r:id="rId15">
+      <w:hyperlink r:id="rId16">
         <w:r>
           <w:rPr>
             <w:color w:val="000000"/>
@@ -428,7 +459,7 @@
     </w:p>
     <w:p>
       <w:r/>
-      <w:hyperlink r:id="rId16">
+      <w:hyperlink r:id="rId17">
         <w:r>
           <w:rPr>
             <w:color w:val="000000"/>
@@ -457,7 +488,7 @@
     </w:p>
     <w:p>
       <w:r/>
-      <w:hyperlink r:id="rId17">
+      <w:hyperlink r:id="rId18">
         <w:r>
           <w:rPr>
             <w:color w:val="000000"/>
@@ -932,12 +963,13 @@
     <w:rsid w:val="00FC693F"/>
     <w:pPr>
       <w:widowControl/>
-      <w:spacing w:line="252" w:lineRule="auto" w:after="80"/>
+      <w:spacing w:line="252" w:lineRule="auto" w:after="60"/>
     </w:pPr>
     <w:rPr>
       <w:rFonts w:ascii="Arial" w:hAnsi="Arial"/>
       <w:color w:val="000000"/>
       <w:sz w:val="21"/>
+      <w:lang w:val="en-GB"/>
     </w:rPr>
   </w:style>
   <w:style w:type="paragraph" w:styleId="Header">
@@ -996,7 +1028,7 @@
       <w:keepNext/>
       <w:keepLines/>
       <w:widowControl/>
-      <w:spacing w:before="200" w:after="80" w:line="252" w:lineRule="auto"/>
+      <w:spacing w:before="160" w:after="60" w:line="252" w:lineRule="auto"/>
       <w:outlineLvl w:val="0"/>
     </w:pPr>
     <w:rPr>
@@ -1006,6 +1038,7 @@
       <w:color w:val="000000"/>
       <w:sz w:val="24"/>
       <w:szCs w:val="28"/>
+      <w:lang w:val="en-GB"/>
     </w:rPr>
   </w:style>
   <w:style w:type="paragraph" w:styleId="Heading2">
@@ -1021,7 +1054,7 @@
       <w:keepNext/>
       <w:keepLines/>
       <w:widowControl/>
-      <w:spacing w:before="200" w:after="80" w:line="252" w:lineRule="auto"/>
+      <w:spacing w:before="160" w:after="60" w:line="252" w:lineRule="auto"/>
       <w:outlineLvl w:val="1"/>
     </w:pPr>
     <w:rPr>
@@ -1031,6 +1064,7 @@
       <w:color w:val="000000"/>
       <w:sz w:val="21"/>
       <w:szCs w:val="26"/>
+      <w:lang w:val="en-GB"/>
     </w:rPr>
   </w:style>
   <w:style w:type="paragraph" w:styleId="Heading3">
@@ -1284,7 +1318,7 @@
     <w:rsid w:val="00FC693F"/>
     <w:pPr>
       <w:widowControl/>
-      <w:spacing w:after="80" w:line="252" w:lineRule="auto"/>
+      <w:spacing w:after="60" w:line="252" w:lineRule="auto"/>
       <w:contextualSpacing/>
     </w:pPr>
     <w:rPr>
@@ -1294,6 +1328,7 @@
       <w:kern w:val="28"/>
       <w:sz w:val="48"/>
       <w:szCs w:val="52"/>
+      <w:lang w:val="en-GB"/>
     </w:rPr>
   </w:style>
   <w:style w:type="character" w:customStyle="1" w:styleId="TitleChar">
@@ -1467,13 +1502,14 @@
       <w:numPr>
         <w:numId w:val="1"/>
       </w:numPr>
-      <w:spacing w:line="252" w:lineRule="auto" w:after="80"/>
+      <w:spacing w:line="252" w:lineRule="auto" w:after="60"/>
       <w:contextualSpacing/>
     </w:pPr>
     <w:rPr>
       <w:rFonts w:ascii="Arial" w:hAnsi="Arial"/>
       <w:color w:val="000000"/>
       <w:sz w:val="21"/>
+      <w:lang w:val="en-GB"/>
     </w:rPr>
   </w:style>
   <w:style w:type="paragraph" w:styleId="ListBullet2">

</xml_diff>